<commit_message>
The other changes after I saved the doc
</commit_message>
<xml_diff>
--- a/Weekly Reports/CS 440 Weekly Report for Week N.docx
+++ b/Weekly Reports/CS 440 Weekly Report for Week N.docx
@@ -1,6 +1,6 @@
 
 <file path=word/document.xml><?xml version="1.0" encoding="utf-8"?>
-<w:document xmlns:wpc="http://schemas.microsoft.com/office/word/2010/wordprocessingCanvas" xmlns:cx="http://schemas.microsoft.com/office/drawing/2014/chartex" xmlns:cx1="http://schemas.microsoft.com/office/drawing/2015/9/8/chartex" xmlns:cx2="http://schemas.microsoft.com/office/drawing/2015/10/21/chartex" xmlns:cx3="http://schemas.microsoft.com/office/drawing/2016/5/9/chartex" xmlns:cx4="http://schemas.microsoft.com/office/drawing/2016/5/10/chartex" xmlns:cx5="http://schemas.microsoft.com/office/drawing/2016/5/11/chartex" xmlns:cx6="http://schemas.microsoft.com/office/drawing/2016/5/12/chartex" xmlns:cx7="http://schemas.microsoft.com/office/drawing/2016/5/13/chartex" xmlns:cx8="http://schemas.microsoft.com/office/drawing/2016/5/14/chartex" xmlns:mc="http://schemas.openxmlformats.org/markup-compatibility/2006" xmlns:aink="http://schemas.microsoft.com/office/drawing/2016/ink" xmlns:am3d="http://schemas.microsoft.com/office/drawing/2017/model3d" xmlns:o="urn:schemas-microsoft-com:office:office" xmlns:oel="http://schemas.microsoft.com/office/2019/extlst" xmlns:r="http://schemas.openxmlformats.org/officeDocument/2006/relationships" xmlns:m="http://schemas.openxmlformats.org/officeDocument/2006/math" xmlns:v="urn:schemas-microsoft-com:vml" xmlns:wp14="http://schemas.microsoft.com/office/word/2010/wordprocessingDrawing" xmlns:wp="http://schemas.openxmlformats.org/drawingml/2006/wordprocessingDrawing" xmlns:w10="urn:schemas-microsoft-com:office:word" xmlns:w="http://schemas.openxmlformats.org/wordprocessingml/2006/main" xmlns:w14="http://schemas.microsoft.com/office/word/2010/wordml" xmlns:w15="http://schemas.microsoft.com/office/word/2012/wordml" xmlns:w16cex="http://schemas.microsoft.com/office/word/2018/wordml/cex" xmlns:w16cid="http://schemas.microsoft.com/office/word/2016/wordml/cid" xmlns:w16="http://schemas.microsoft.com/office/word/2018/wordml" xmlns:w16sdtdh="http://schemas.microsoft.com/office/word/2020/wordml/sdtdatahash" xmlns:w16se="http://schemas.microsoft.com/office/word/2015/wordml/symex" xmlns:wpg="http://schemas.microsoft.com/office/word/2010/wordprocessingGroup" xmlns:wpi="http://schemas.microsoft.com/office/word/2010/wordprocessingInk" xmlns:wne="http://schemas.microsoft.com/office/word/2006/wordml" xmlns:wps="http://schemas.microsoft.com/office/word/2010/wordprocessingShape" mc:Ignorable="w14 w15 w16se w16cid w16 w16cex w16sdtdh wp14">
+<w:document xmlns:wpc="http://schemas.microsoft.com/office/word/2010/wordprocessingCanvas" xmlns:cx="http://schemas.microsoft.com/office/drawing/2014/chartex" xmlns:cx1="http://schemas.microsoft.com/office/drawing/2015/9/8/chartex" xmlns:cx2="http://schemas.microsoft.com/office/drawing/2015/10/21/chartex" xmlns:cx3="http://schemas.microsoft.com/office/drawing/2016/5/9/chartex" xmlns:cx4="http://schemas.microsoft.com/office/drawing/2016/5/10/chartex" xmlns:cx5="http://schemas.microsoft.com/office/drawing/2016/5/11/chartex" xmlns:cx6="http://schemas.microsoft.com/office/drawing/2016/5/12/chartex" xmlns:cx7="http://schemas.microsoft.com/office/drawing/2016/5/13/chartex" xmlns:cx8="http://schemas.microsoft.com/office/drawing/2016/5/14/chartex" xmlns:mc="http://schemas.openxmlformats.org/markup-compatibility/2006" xmlns:aink="http://schemas.microsoft.com/office/drawing/2016/ink" xmlns:am3d="http://schemas.microsoft.com/office/drawing/2017/model3d" xmlns:o="urn:schemas-microsoft-com:office:office" xmlns:oel="http://schemas.microsoft.com/office/2019/extlst" xmlns:r="http://schemas.openxmlformats.org/officeDocument/2006/relationships" xmlns:m="http://schemas.openxmlformats.org/officeDocument/2006/math" xmlns:v="urn:schemas-microsoft-com:vml" xmlns:wp14="http://schemas.microsoft.com/office/word/2010/wordprocessingDrawing" xmlns:wp="http://schemas.openxmlformats.org/drawingml/2006/wordprocessingDrawing" xmlns:w10="urn:schemas-microsoft-com:office:word" xmlns:w="http://schemas.openxmlformats.org/wordprocessingml/2006/main" xmlns:w14="http://schemas.microsoft.com/office/word/2010/wordml" xmlns:w15="http://schemas.microsoft.com/office/word/2012/wordml" xmlns:w16cex="http://schemas.microsoft.com/office/word/2018/wordml/cex" xmlns:w16cid="http://schemas.microsoft.com/office/word/2016/wordml/cid" xmlns:w16="http://schemas.microsoft.com/office/word/2018/wordml" xmlns:w16du="http://schemas.microsoft.com/office/word/2023/wordml/word16du" xmlns:w16sdtdh="http://schemas.microsoft.com/office/word/2020/wordml/sdtdatahash" xmlns:w16sdtfl="http://schemas.microsoft.com/office/word/2024/wordml/sdtformatlock" xmlns:w16se="http://schemas.microsoft.com/office/word/2015/wordml/symex" xmlns:wpg="http://schemas.microsoft.com/office/word/2010/wordprocessingGroup" xmlns:wpi="http://schemas.microsoft.com/office/word/2010/wordprocessingInk" xmlns:wne="http://schemas.microsoft.com/office/word/2006/wordml" xmlns:wps="http://schemas.microsoft.com/office/word/2010/wordprocessingShape" mc:Ignorable="w14 w15 w16se w16cid w16 w16cex w16sdtdh w16sdtfl w16du wp14">
   <w:body>
     <w:p>
       <w:pPr>
@@ -31,12 +31,56 @@
           <w:szCs w:val="22"/>
           <w:u w:val="single"/>
         </w:rPr>
-        <w:t xml:space="preserve"> – CS 440 Group X for Week Y</w:t>
+        <w:t xml:space="preserve"> – CS 440 Group </w:t>
+      </w:r>
+      <w:r>
+        <w:rPr>
+          <w:b/>
+          <w:bCs/>
+          <w:sz w:val="28"/>
+          <w:szCs w:val="22"/>
+          <w:u w:val="single"/>
+        </w:rPr>
+        <w:t>4</w:t>
+      </w:r>
+      <w:r>
+        <w:rPr>
+          <w:b/>
+          <w:bCs/>
+          <w:sz w:val="28"/>
+          <w:szCs w:val="22"/>
+          <w:u w:val="single"/>
+        </w:rPr>
+        <w:t xml:space="preserve"> for Week </w:t>
+      </w:r>
+      <w:r>
+        <w:rPr>
+          <w:b/>
+          <w:bCs/>
+          <w:sz w:val="28"/>
+          <w:szCs w:val="22"/>
+          <w:u w:val="single"/>
+        </w:rPr>
+        <w:t>3</w:t>
       </w:r>
     </w:p>
     <w:p>
       <w:r>
-        <w:t xml:space="preserve">Group Members:  </w:t>
+        <w:t>Group Members:</w:t>
+      </w:r>
+      <w:r>
+        <w:t xml:space="preserve"> Manan Patel, Ashton </w:t>
+      </w:r>
+      <w:proofErr w:type="spellStart"/>
+      <w:r>
+        <w:t>Edakkunnathu</w:t>
+      </w:r>
+      <w:proofErr w:type="spellEnd"/>
+      <w:r>
+        <w:t>, Jay Patel, Lena Tran</w:t>
+      </w:r>
+      <w:r>
+        <w:t xml:space="preserve">  </w:t>
       </w:r>
     </w:p>
     <w:p>
@@ -67,6 +111,9 @@
       <w:r>
         <w:t>When:</w:t>
       </w:r>
+      <w:r>
+        <w:t xml:space="preserve"> </w:t>
+      </w:r>
     </w:p>
     <w:p>
       <w:pPr>
@@ -89,7 +136,23 @@
         </w:numPr>
       </w:pPr>
       <w:r>
-        <w:t>Missing ( why ) :</w:t>
+        <w:t xml:space="preserve">Missing </w:t>
+      </w:r>
+      <w:proofErr w:type="gramStart"/>
+      <w:r>
+        <w:t>( why</w:t>
+      </w:r>
+      <w:proofErr w:type="gramEnd"/>
+      <w:r>
+        <w:t xml:space="preserve"> </w:t>
+      </w:r>
+      <w:proofErr w:type="gramStart"/>
+      <w:r>
+        <w:t>) :</w:t>
+      </w:r>
+      <w:proofErr w:type="gramEnd"/>
+      <w:r>
+        <w:t xml:space="preserve"> </w:t>
       </w:r>
     </w:p>
     <w:p>
@@ -101,7 +164,23 @@
         </w:numPr>
       </w:pPr>
       <w:r>
-        <w:t>Late ( why ) :</w:t>
+        <w:t xml:space="preserve">Late </w:t>
+      </w:r>
+      <w:proofErr w:type="gramStart"/>
+      <w:r>
+        <w:t>( why</w:t>
+      </w:r>
+      <w:proofErr w:type="gramEnd"/>
+      <w:r>
+        <w:t xml:space="preserve"> </w:t>
+      </w:r>
+      <w:proofErr w:type="gramStart"/>
+      <w:r>
+        <w:t>) :</w:t>
+      </w:r>
+      <w:proofErr w:type="gramEnd"/>
+      <w:r>
+        <w:t xml:space="preserve"> </w:t>
       </w:r>
     </w:p>
     <w:p>
@@ -130,7 +209,10 @@
         </w:numPr>
       </w:pPr>
       <w:r>
-        <w:t>Member 1:</w:t>
+        <w:t>Jay Patel</w:t>
+      </w:r>
+      <w:r>
+        <w:t>:</w:t>
       </w:r>
     </w:p>
     <w:p>
@@ -142,7 +224,15 @@
         </w:numPr>
       </w:pPr>
       <w:r>
-        <w:t>Member 2:</w:t>
+        <w:t xml:space="preserve">Ashton </w:t>
+      </w:r>
+      <w:proofErr w:type="spellStart"/>
+      <w:r>
+        <w:t>Edakkunnathu</w:t>
+      </w:r>
+      <w:proofErr w:type="spellEnd"/>
+      <w:r>
+        <w:t>:</w:t>
       </w:r>
     </w:p>
     <w:p>
@@ -154,7 +244,10 @@
         </w:numPr>
       </w:pPr>
       <w:r>
-        <w:t>Member 3:</w:t>
+        <w:t>Manan Patel</w:t>
+      </w:r>
+      <w:r>
+        <w:t>:</w:t>
       </w:r>
     </w:p>
     <w:p>
@@ -166,7 +259,10 @@
         </w:numPr>
       </w:pPr>
       <w:r>
-        <w:t>Member 4:</w:t>
+        <w:t>Lena Tran</w:t>
+      </w:r>
+      <w:r>
+        <w:t>:</w:t>
       </w:r>
     </w:p>
     <w:p>
@@ -183,8 +279,54 @@
           <w:bCs/>
           <w:u w:val="single"/>
         </w:rPr>
-        <w:t>Current Action Items ( Work In Progress )</w:t>
-      </w:r>
+        <w:t xml:space="preserve">Current Action Items </w:t>
+      </w:r>
+      <w:proofErr w:type="gramStart"/>
+      <w:r>
+        <w:rPr>
+          <w:b/>
+          <w:bCs/>
+          <w:u w:val="single"/>
+        </w:rPr>
+        <w:t>( Work</w:t>
+      </w:r>
+      <w:proofErr w:type="gramEnd"/>
+      <w:r>
+        <w:rPr>
+          <w:b/>
+          <w:bCs/>
+          <w:u w:val="single"/>
+        </w:rPr>
+        <w:t xml:space="preserve"> </w:t>
+      </w:r>
+      <w:proofErr w:type="gramStart"/>
+      <w:r>
+        <w:rPr>
+          <w:b/>
+          <w:bCs/>
+          <w:u w:val="single"/>
+        </w:rPr>
+        <w:t>In</w:t>
+      </w:r>
+      <w:proofErr w:type="gramEnd"/>
+      <w:r>
+        <w:rPr>
+          <w:b/>
+          <w:bCs/>
+          <w:u w:val="single"/>
+        </w:rPr>
+        <w:t xml:space="preserve"> </w:t>
+      </w:r>
+      <w:proofErr w:type="gramStart"/>
+      <w:r>
+        <w:rPr>
+          <w:b/>
+          <w:bCs/>
+          <w:u w:val="single"/>
+        </w:rPr>
+        <w:t>Progress )</w:t>
+      </w:r>
+      <w:proofErr w:type="gramEnd"/>
     </w:p>
     <w:p>
       <w:pPr>
@@ -195,7 +337,10 @@
         </w:numPr>
       </w:pPr>
       <w:r>
-        <w:t>Member 1:</w:t>
+        <w:t>Jay Patel</w:t>
+      </w:r>
+      <w:r>
+        <w:t>:</w:t>
       </w:r>
     </w:p>
     <w:p>
@@ -207,7 +352,15 @@
         </w:numPr>
       </w:pPr>
       <w:r>
-        <w:t>Member 2:</w:t>
+        <w:t xml:space="preserve">Ashton </w:t>
+      </w:r>
+      <w:proofErr w:type="spellStart"/>
+      <w:r>
+        <w:t>Edakkunnathu</w:t>
+      </w:r>
+      <w:proofErr w:type="spellEnd"/>
+      <w:r>
+        <w:t>:</w:t>
       </w:r>
     </w:p>
     <w:p>
@@ -219,7 +372,10 @@
         </w:numPr>
       </w:pPr>
       <w:r>
-        <w:t>Member 3:</w:t>
+        <w:t>Manan Patel</w:t>
+      </w:r>
+      <w:r>
+        <w:t>:</w:t>
       </w:r>
     </w:p>
     <w:p>
@@ -231,7 +387,10 @@
         </w:numPr>
       </w:pPr>
       <w:r>
-        <w:t>Member 4:</w:t>
+        <w:t>Lena Tran</w:t>
+      </w:r>
+      <w:r>
+        <w:t>:</w:t>
       </w:r>
     </w:p>
     <w:sectPr>
@@ -245,7 +404,7 @@
 </file>
 
 <file path=word/numbering.xml><?xml version="1.0" encoding="utf-8"?>
-<w:numbering xmlns:wpc="http://schemas.microsoft.com/office/word/2010/wordprocessingCanvas" xmlns:cx="http://schemas.microsoft.com/office/drawing/2014/chartex" xmlns:cx1="http://schemas.microsoft.com/office/drawing/2015/9/8/chartex" xmlns:cx2="http://schemas.microsoft.com/office/drawing/2015/10/21/chartex" xmlns:cx3="http://schemas.microsoft.com/office/drawing/2016/5/9/chartex" xmlns:cx4="http://schemas.microsoft.com/office/drawing/2016/5/10/chartex" xmlns:cx5="http://schemas.microsoft.com/office/drawing/2016/5/11/chartex" xmlns:cx6="http://schemas.microsoft.com/office/drawing/2016/5/12/chartex" xmlns:cx7="http://schemas.microsoft.com/office/drawing/2016/5/13/chartex" xmlns:cx8="http://schemas.microsoft.com/office/drawing/2016/5/14/chartex" xmlns:mc="http://schemas.openxmlformats.org/markup-compatibility/2006" xmlns:aink="http://schemas.microsoft.com/office/drawing/2016/ink" xmlns:am3d="http://schemas.microsoft.com/office/drawing/2017/model3d" xmlns:o="urn:schemas-microsoft-com:office:office" xmlns:oel="http://schemas.microsoft.com/office/2019/extlst" xmlns:r="http://schemas.openxmlformats.org/officeDocument/2006/relationships" xmlns:m="http://schemas.openxmlformats.org/officeDocument/2006/math" xmlns:v="urn:schemas-microsoft-com:vml" xmlns:wp14="http://schemas.microsoft.com/office/word/2010/wordprocessingDrawing" xmlns:wp="http://schemas.openxmlformats.org/drawingml/2006/wordprocessingDrawing" xmlns:w10="urn:schemas-microsoft-com:office:word" xmlns:w="http://schemas.openxmlformats.org/wordprocessingml/2006/main" xmlns:w14="http://schemas.microsoft.com/office/word/2010/wordml" xmlns:w15="http://schemas.microsoft.com/office/word/2012/wordml" xmlns:w16cex="http://schemas.microsoft.com/office/word/2018/wordml/cex" xmlns:w16cid="http://schemas.microsoft.com/office/word/2016/wordml/cid" xmlns:w16="http://schemas.microsoft.com/office/word/2018/wordml" xmlns:w16sdtdh="http://schemas.microsoft.com/office/word/2020/wordml/sdtdatahash" xmlns:w16se="http://schemas.microsoft.com/office/word/2015/wordml/symex" xmlns:wpg="http://schemas.microsoft.com/office/word/2010/wordprocessingGroup" xmlns:wpi="http://schemas.microsoft.com/office/word/2010/wordprocessingInk" xmlns:wne="http://schemas.microsoft.com/office/word/2006/wordml" xmlns:wps="http://schemas.microsoft.com/office/word/2010/wordprocessingShape" mc:Ignorable="w14 w15 w16se w16cid w16 w16cex w16sdtdh wp14">
+<w:numbering xmlns:wpc="http://schemas.microsoft.com/office/word/2010/wordprocessingCanvas" xmlns:cx="http://schemas.microsoft.com/office/drawing/2014/chartex" xmlns:cx1="http://schemas.microsoft.com/office/drawing/2015/9/8/chartex" xmlns:cx2="http://schemas.microsoft.com/office/drawing/2015/10/21/chartex" xmlns:cx3="http://schemas.microsoft.com/office/drawing/2016/5/9/chartex" xmlns:cx4="http://schemas.microsoft.com/office/drawing/2016/5/10/chartex" xmlns:cx5="http://schemas.microsoft.com/office/drawing/2016/5/11/chartex" xmlns:cx6="http://schemas.microsoft.com/office/drawing/2016/5/12/chartex" xmlns:cx7="http://schemas.microsoft.com/office/drawing/2016/5/13/chartex" xmlns:cx8="http://schemas.microsoft.com/office/drawing/2016/5/14/chartex" xmlns:mc="http://schemas.openxmlformats.org/markup-compatibility/2006" xmlns:aink="http://schemas.microsoft.com/office/drawing/2016/ink" xmlns:am3d="http://schemas.microsoft.com/office/drawing/2017/model3d" xmlns:o="urn:schemas-microsoft-com:office:office" xmlns:oel="http://schemas.microsoft.com/office/2019/extlst" xmlns:r="http://schemas.openxmlformats.org/officeDocument/2006/relationships" xmlns:m="http://schemas.openxmlformats.org/officeDocument/2006/math" xmlns:v="urn:schemas-microsoft-com:vml" xmlns:wp14="http://schemas.microsoft.com/office/word/2010/wordprocessingDrawing" xmlns:wp="http://schemas.openxmlformats.org/drawingml/2006/wordprocessingDrawing" xmlns:w10="urn:schemas-microsoft-com:office:word" xmlns:w="http://schemas.openxmlformats.org/wordprocessingml/2006/main" xmlns:w14="http://schemas.microsoft.com/office/word/2010/wordml" xmlns:w15="http://schemas.microsoft.com/office/word/2012/wordml" xmlns:w16cex="http://schemas.microsoft.com/office/word/2018/wordml/cex" xmlns:w16cid="http://schemas.microsoft.com/office/word/2016/wordml/cid" xmlns:w16="http://schemas.microsoft.com/office/word/2018/wordml" xmlns:w16du="http://schemas.microsoft.com/office/word/2023/wordml/word16du" xmlns:w16sdtdh="http://schemas.microsoft.com/office/word/2020/wordml/sdtdatahash" xmlns:w16sdtfl="http://schemas.microsoft.com/office/word/2024/wordml/sdtformatlock" xmlns:w16se="http://schemas.microsoft.com/office/word/2015/wordml/symex" xmlns:wpg="http://schemas.microsoft.com/office/word/2010/wordprocessingGroup" xmlns:wpi="http://schemas.microsoft.com/office/word/2010/wordprocessingInk" xmlns:wne="http://schemas.microsoft.com/office/word/2006/wordml" xmlns:wps="http://schemas.microsoft.com/office/word/2010/wordprocessingShape" mc:Ignorable="w14 w15 w16se w16cid w16 w16cex w16sdtdh w16sdtfl w16du wp14">
   <w:abstractNum w:abstractNumId="0" w15:restartNumberingAfterBreak="0">
     <w:nsid w:val="4C383463"/>
     <w:multiLevelType w:val="hybridMultilevel"/>
@@ -482,7 +641,7 @@
 </file>
 
 <file path=word/styles.xml><?xml version="1.0" encoding="utf-8"?>
-<w:styles xmlns:mc="http://schemas.openxmlformats.org/markup-compatibility/2006" xmlns:r="http://schemas.openxmlformats.org/officeDocument/2006/relationships" xmlns:w="http://schemas.openxmlformats.org/wordprocessingml/2006/main" xmlns:w14="http://schemas.microsoft.com/office/word/2010/wordml" xmlns:w15="http://schemas.microsoft.com/office/word/2012/wordml" xmlns:w16cex="http://schemas.microsoft.com/office/word/2018/wordml/cex" xmlns:w16cid="http://schemas.microsoft.com/office/word/2016/wordml/cid" xmlns:w16="http://schemas.microsoft.com/office/word/2018/wordml" xmlns:w16sdtdh="http://schemas.microsoft.com/office/word/2020/wordml/sdtdatahash" xmlns:w16se="http://schemas.microsoft.com/office/word/2015/wordml/symex" mc:Ignorable="w14 w15 w16se w16cid w16 w16cex w16sdtdh">
+<w:styles xmlns:mc="http://schemas.openxmlformats.org/markup-compatibility/2006" xmlns:r="http://schemas.openxmlformats.org/officeDocument/2006/relationships" xmlns:w="http://schemas.openxmlformats.org/wordprocessingml/2006/main" xmlns:w14="http://schemas.microsoft.com/office/word/2010/wordml" xmlns:w15="http://schemas.microsoft.com/office/word/2012/wordml" xmlns:w16cex="http://schemas.microsoft.com/office/word/2018/wordml/cex" xmlns:w16cid="http://schemas.microsoft.com/office/word/2016/wordml/cid" xmlns:w16="http://schemas.microsoft.com/office/word/2018/wordml" xmlns:w16du="http://schemas.microsoft.com/office/word/2023/wordml/word16du" xmlns:w16sdtdh="http://schemas.microsoft.com/office/word/2020/wordml/sdtdatahash" xmlns:w16sdtfl="http://schemas.microsoft.com/office/word/2024/wordml/sdtformatlock" xmlns:w16se="http://schemas.microsoft.com/office/word/2015/wordml/symex" mc:Ignorable="w14 w15 w16se w16cid w16 w16cex w16sdtdh w16sdtfl w16du">
   <w:docDefaults>
     <w:rPrDefault>
       <w:rPr>

</xml_diff>

<commit_message>
saved the previous change
</commit_message>
<xml_diff>
--- a/Weekly Reports/CS 440 Weekly Report for Week N.docx
+++ b/Weekly Reports/CS 440 Weekly Report for Week N.docx
@@ -129,6 +129,9 @@
       <w:r>
         <w:t xml:space="preserve"> Letterman Chicago</w:t>
       </w:r>
+      <w:r>
+        <w:t xml:space="preserve"> Downstairs Lobby</w:t>
+      </w:r>
     </w:p>
     <w:p>
       <w:pPr>
@@ -250,10 +253,7 @@
         <w:t>:</w:t>
       </w:r>
       <w:r>
-        <w:t xml:space="preserve"> </w:t>
-      </w:r>
-      <w:r>
-        <w:t>Decided Project + Made Google Doc for Project + Read Report</w:t>
+        <w:t xml:space="preserve"> Decided Project + Made Google Doc for Project + Read Report</w:t>
       </w:r>
     </w:p>
     <w:p>
@@ -271,10 +271,7 @@
         <w:t>:</w:t>
       </w:r>
       <w:r>
-        <w:t xml:space="preserve"> </w:t>
-      </w:r>
-      <w:r>
-        <w:t>Decided Project + Made Google Doc for Project + Read Report</w:t>
+        <w:t xml:space="preserve"> Decided Project + Made Google Doc for Project + Read Report</w:t>
       </w:r>
     </w:p>
     <w:p>
@@ -292,10 +289,7 @@
         <w:t>:</w:t>
       </w:r>
       <w:r>
-        <w:t xml:space="preserve"> </w:t>
-      </w:r>
-      <w:r>
-        <w:t>Decided Project + Made Google Doc for Project + Read Report</w:t>
+        <w:t xml:space="preserve"> Decided Project + Made Google Doc for Project + Read Report</w:t>
       </w:r>
     </w:p>
     <w:p>
@@ -383,6 +377,65 @@
       <w:pPr>
         <w:pStyle w:val="ListParagraph"/>
         <w:numPr>
+          <w:ilvl w:val="1"/>
+          <w:numId w:val="2"/>
+        </w:numPr>
+      </w:pPr>
+      <w:r>
+        <w:rPr>
+          <w:b/>
+          <w:bCs/>
+        </w:rPr>
+        <w:t xml:space="preserve">Implementation: </w:t>
+      </w:r>
+    </w:p>
+    <w:p>
+      <w:pPr>
+        <w:pStyle w:val="ListParagraph"/>
+        <w:numPr>
+          <w:ilvl w:val="2"/>
+          <w:numId w:val="2"/>
+        </w:numPr>
+      </w:pPr>
+      <w:r>
+        <w:t xml:space="preserve">Purchase Camera used for Computer Vision </w:t>
+      </w:r>
+    </w:p>
+    <w:p>
+      <w:pPr>
+        <w:pStyle w:val="ListParagraph"/>
+        <w:numPr>
+          <w:ilvl w:val="3"/>
+          <w:numId w:val="2"/>
+        </w:numPr>
+      </w:pPr>
+      <w:r>
+        <w:t xml:space="preserve">Write script to capture frames </w:t>
+      </w:r>
+      <w:r>
+        <w:t xml:space="preserve">and store somewhere </w:t>
+      </w:r>
+    </w:p>
+    <w:p>
+      <w:pPr>
+        <w:pStyle w:val="ListParagraph"/>
+        <w:numPr>
+          <w:ilvl w:val="1"/>
+          <w:numId w:val="2"/>
+        </w:numPr>
+      </w:pPr>
+      <w:r>
+        <w:rPr>
+          <w:b/>
+          <w:bCs/>
+        </w:rPr>
+        <w:t xml:space="preserve">Design: </w:t>
+      </w:r>
+    </w:p>
+    <w:p>
+      <w:pPr>
+        <w:pStyle w:val="ListParagraph"/>
+        <w:numPr>
           <w:ilvl w:val="0"/>
           <w:numId w:val="2"/>
         </w:numPr>
@@ -399,7 +452,51 @@
         <w:t>:</w:t>
       </w:r>
       <w:r>
-        <w:t xml:space="preserve"> Drone (Hardware) Research (DIY or Prebuilt Drone and hardware list?)</w:t>
+        <w:t xml:space="preserve"> </w:t>
+      </w:r>
+    </w:p>
+    <w:p>
+      <w:pPr>
+        <w:pStyle w:val="ListParagraph"/>
+        <w:numPr>
+          <w:ilvl w:val="1"/>
+          <w:numId w:val="2"/>
+        </w:numPr>
+      </w:pPr>
+      <w:r>
+        <w:rPr>
+          <w:b/>
+          <w:bCs/>
+        </w:rPr>
+        <w:t xml:space="preserve">Implementation: </w:t>
+      </w:r>
+    </w:p>
+    <w:p>
+      <w:pPr>
+        <w:pStyle w:val="ListParagraph"/>
+        <w:numPr>
+          <w:ilvl w:val="2"/>
+          <w:numId w:val="2"/>
+        </w:numPr>
+      </w:pPr>
+      <w:r>
+        <w:t>Start set up for CNN yolov8 + Test current model with sample content (1 animal)</w:t>
+      </w:r>
+    </w:p>
+    <w:p>
+      <w:pPr>
+        <w:pStyle w:val="ListParagraph"/>
+        <w:numPr>
+          <w:ilvl w:val="1"/>
+          <w:numId w:val="2"/>
+        </w:numPr>
+      </w:pPr>
+      <w:r>
+        <w:rPr>
+          <w:b/>
+          <w:bCs/>
+        </w:rPr>
+        <w:t xml:space="preserve">Design: </w:t>
       </w:r>
     </w:p>
     <w:p>
@@ -417,7 +514,39 @@
         <w:t>:</w:t>
       </w:r>
       <w:r>
-        <w:t xml:space="preserve"> Computer Vision Research (how to access a picture and read from it?)</w:t>
+        <w:t xml:space="preserve"> </w:t>
+      </w:r>
+    </w:p>
+    <w:p>
+      <w:pPr>
+        <w:pStyle w:val="ListParagraph"/>
+        <w:numPr>
+          <w:ilvl w:val="1"/>
+          <w:numId w:val="2"/>
+        </w:numPr>
+      </w:pPr>
+      <w:r>
+        <w:rPr>
+          <w:b/>
+          <w:bCs/>
+        </w:rPr>
+        <w:t xml:space="preserve">Implementation: </w:t>
+      </w:r>
+    </w:p>
+    <w:p>
+      <w:pPr>
+        <w:pStyle w:val="ListParagraph"/>
+        <w:numPr>
+          <w:ilvl w:val="1"/>
+          <w:numId w:val="2"/>
+        </w:numPr>
+      </w:pPr>
+      <w:r>
+        <w:rPr>
+          <w:b/>
+          <w:bCs/>
+        </w:rPr>
+        <w:t xml:space="preserve">Design: </w:t>
       </w:r>
     </w:p>
     <w:p>
@@ -435,7 +564,39 @@
         <w:t>:</w:t>
       </w:r>
       <w:r>
-        <w:t xml:space="preserve"> Codebase setup (how to set it up?)</w:t>
+        <w:t xml:space="preserve"> </w:t>
+      </w:r>
+    </w:p>
+    <w:p>
+      <w:pPr>
+        <w:pStyle w:val="ListParagraph"/>
+        <w:numPr>
+          <w:ilvl w:val="1"/>
+          <w:numId w:val="2"/>
+        </w:numPr>
+      </w:pPr>
+      <w:r>
+        <w:rPr>
+          <w:b/>
+          <w:bCs/>
+        </w:rPr>
+        <w:t xml:space="preserve">Implementation: </w:t>
+      </w:r>
+    </w:p>
+    <w:p>
+      <w:pPr>
+        <w:pStyle w:val="ListParagraph"/>
+        <w:numPr>
+          <w:ilvl w:val="1"/>
+          <w:numId w:val="2"/>
+        </w:numPr>
+      </w:pPr>
+      <w:r>
+        <w:rPr>
+          <w:b/>
+          <w:bCs/>
+        </w:rPr>
+        <w:t xml:space="preserve">Design: </w:t>
       </w:r>
     </w:p>
     <w:sectPr>
@@ -579,7 +740,7 @@
         <w:rFonts w:ascii="Symbol" w:hAnsi="Symbol" w:hint="default"/>
       </w:rPr>
     </w:lvl>
-    <w:lvl w:ilvl="1" w:tplc="04090003" w:tentative="1">
+    <w:lvl w:ilvl="1" w:tplc="04090003">
       <w:start w:val="1"/>
       <w:numFmt w:val="bullet"/>
       <w:lvlText w:val="o"/>
@@ -591,7 +752,7 @@
         <w:rFonts w:ascii="Courier New" w:hAnsi="Courier New" w:cs="Courier New" w:hint="default"/>
       </w:rPr>
     </w:lvl>
-    <w:lvl w:ilvl="2" w:tplc="04090005" w:tentative="1">
+    <w:lvl w:ilvl="2" w:tplc="04090005">
       <w:start w:val="1"/>
       <w:numFmt w:val="bullet"/>
       <w:lvlText w:val=""/>
@@ -603,7 +764,7 @@
         <w:rFonts w:ascii="Wingdings" w:hAnsi="Wingdings" w:hint="default"/>
       </w:rPr>
     </w:lvl>
-    <w:lvl w:ilvl="3" w:tplc="04090001" w:tentative="1">
+    <w:lvl w:ilvl="3" w:tplc="04090001">
       <w:start w:val="1"/>
       <w:numFmt w:val="bullet"/>
       <w:lvlText w:val=""/>

</xml_diff>